<commit_message>
Scaffold Phase 1 backend and frontend, switch LLM provider to OpenAI
- backend/: FastAPI + SQLAlchemy/Alembic + SQS worker implementing the
  Phase 1 core loop (auth, JD CRUD, async resume ingestion/evaluation,
  ranking, human-only decision audit trail), verified end-to-end against
  local Postgres/LocalStack.
- frontend/: Next.js 16 (App Router) + Tailwind/shadcn/TanStack Query &
  Table, SPA-style auth against the backend API, covering the same Phase 1
  flows through to the ranked candidate list and status-change dialog.
- Switch the locked LLM provider from Anthropic Claude to OpenAI across
  CLAUDE.md, the architecture diagrams, and the solution document.

Co-Authored-By: Claude Sonnet 5 <noreply@anthropic.com>
</commit_message>
<xml_diff>
--- a/docs/solution-document/HireSense-Solution-Document.docx
+++ b/docs/solution-document/HireSense-Solution-Document.docx
@@ -111,7 +111,7 @@
           </w:tcPr>
           <w:p>
             <w:r>
-              <w:t>22 September 2026</w:t>
+              <w:t>23 September 2026</w:t>
             </w:r>
           </w:p>
         </w:tc>
@@ -1781,7 +1781,7 @@
       <w:r>
         <w:drawing>
           <wp:inline xmlns:a="http://schemas.openxmlformats.org/drawingml/2006/main" xmlns:pic="http://schemas.openxmlformats.org/drawingml/2006/picture">
-            <wp:extent cx="4422765" cy="7772400"/>
+            <wp:extent cx="4483194" cy="7772400"/>
             <wp:docPr id="4" name="Picture 4"/>
             <wp:cNvGraphicFramePr>
               <a:graphicFrameLocks noChangeAspect="1"/>
@@ -1802,7 +1802,7 @@
                   <pic:spPr>
                     <a:xfrm>
                       <a:off x="0" y="0"/>
-                      <a:ext cx="4422765" cy="7772400"/>
+                      <a:ext cx="4483194" cy="7772400"/>
                     </a:xfrm>
                     <a:prstGeom prst="rect"/>
                   </pic:spPr>
@@ -2051,7 +2051,7 @@
           </w:tcPr>
           <w:p>
             <w:r>
-              <w:t>Anthropic API key, DB credentials, JWT signing key — never stored in code or images.</w:t>
+              <w:t>OpenAI API key, DB credentials, JWT signing key — never stored in code or images.</w:t>
             </w:r>
           </w:p>
         </w:tc>
@@ -2326,7 +2326,7 @@
           </w:tcPr>
           <w:p>
             <w:r>
-              <w:t>Anthropic Claude API, structured/tool-use output for scoring and extraction</w:t>
+              <w:t>OpenAI API, structured outputs / function calling for scoring and extraction</w:t>
             </w:r>
           </w:p>
         </w:tc>

</xml_diff>